<commit_message>
URL to Kaggle Dataset
</commit_message>
<xml_diff>
--- a/Group1_MidTerm_14406_DatasetURL.docx
+++ b/Group1_MidTerm_14406_DatasetURL.docx
@@ -29,6 +29,10 @@
     <w:p>
       <w:pPr>
         <w:spacing w:after="80"/>
+        <w:rPr>
+          <w:sz w:val="22"/>
+          <w:szCs w:val="22"/>
+        </w:rPr>
       </w:pPr>
       <w:r>
         <w:rPr>
@@ -58,6 +62,27 @@
           <w:sz w:val="22"/>
           <w:szCs w:val="22"/>
         </w:rPr>
+        <w:t>Group Name:</w:t>
+      </w:r>
+      <w:r>
+        <w:rPr>
+          <w:sz w:val="22"/>
+          <w:szCs w:val="22"/>
+        </w:rPr>
+        <w:t xml:space="preserve"> Group 1</w:t>
+      </w:r>
+    </w:p>
+    <w:p>
+      <w:pPr>
+        <w:spacing w:after="80"/>
+      </w:pPr>
+      <w:r>
+        <w:rPr>
+          <w:b/>
+          <w:bCs/>
+          <w:sz w:val="22"/>
+          <w:szCs w:val="22"/>
+        </w:rPr>
         <w:t xml:space="preserve">Team Members: </w:t>
       </w:r>
       <w:r>
@@ -65,60 +90,42 @@
           <w:sz w:val="22"/>
           <w:szCs w:val="22"/>
         </w:rPr>
-        <w:t xml:space="preserve">Alfredo </w:t>
-      </w:r>
-      <w:proofErr w:type="gramStart"/>
-      <w:r>
-        <w:rPr>
-          <w:sz w:val="22"/>
-          <w:szCs w:val="22"/>
-        </w:rPr>
-        <w:t>Garza</w:t>
-      </w:r>
-      <w:r>
-        <w:rPr>
-          <w:sz w:val="22"/>
-          <w:szCs w:val="22"/>
-        </w:rPr>
-        <w:t xml:space="preserve">  |</w:t>
-      </w:r>
-      <w:proofErr w:type="gramEnd"/>
-      <w:r>
-        <w:rPr>
-          <w:sz w:val="22"/>
-          <w:szCs w:val="22"/>
-        </w:rPr>
-        <w:t xml:space="preserve">  </w:t>
-      </w:r>
-      <w:r>
-        <w:rPr>
-          <w:sz w:val="22"/>
-          <w:szCs w:val="22"/>
-        </w:rPr>
-        <w:t xml:space="preserve">Unnati </w:t>
-      </w:r>
-      <w:proofErr w:type="gramStart"/>
-      <w:r>
-        <w:rPr>
-          <w:sz w:val="22"/>
-          <w:szCs w:val="22"/>
-        </w:rPr>
-        <w:t>Shakya</w:t>
-      </w:r>
-      <w:r>
-        <w:rPr>
-          <w:sz w:val="22"/>
-          <w:szCs w:val="22"/>
-        </w:rPr>
-        <w:t xml:space="preserve">  |</w:t>
-      </w:r>
-      <w:proofErr w:type="gramEnd"/>
-      <w:r>
-        <w:rPr>
-          <w:sz w:val="22"/>
-          <w:szCs w:val="22"/>
-        </w:rPr>
-        <w:t xml:space="preserve">  </w:t>
+        <w:t>Alfredo Garza</w:t>
+      </w:r>
+      <w:r>
+        <w:rPr>
+          <w:sz w:val="22"/>
+          <w:szCs w:val="22"/>
+        </w:rPr>
+        <w:t xml:space="preserve"> </w:t>
+      </w:r>
+      <w:r>
+        <w:rPr>
+          <w:sz w:val="22"/>
+          <w:szCs w:val="22"/>
+        </w:rPr>
+        <w:t>| Unnati</w:t>
+      </w:r>
+      <w:r>
+        <w:rPr>
+          <w:sz w:val="22"/>
+          <w:szCs w:val="22"/>
+        </w:rPr>
+        <w:t xml:space="preserve"> </w:t>
+      </w:r>
+      <w:r>
+        <w:rPr>
+          <w:sz w:val="22"/>
+          <w:szCs w:val="22"/>
+        </w:rPr>
+        <w:t>Shakya |</w:t>
+      </w:r>
+      <w:r>
+        <w:rPr>
+          <w:sz w:val="22"/>
+          <w:szCs w:val="22"/>
+        </w:rPr>
+        <w:t xml:space="preserve"> </w:t>
       </w:r>
       <w:r>
         <w:rPr>
@@ -155,7 +162,36 @@
           <w:sz w:val="22"/>
           <w:szCs w:val="22"/>
         </w:rPr>
-        <w:t>March 2026</w:t>
+        <w:t>25</w:t>
+      </w:r>
+      <w:r>
+        <w:rPr>
+          <w:sz w:val="22"/>
+          <w:szCs w:val="22"/>
+          <w:vertAlign w:val="superscript"/>
+        </w:rPr>
+        <w:t>th</w:t>
+      </w:r>
+      <w:r>
+        <w:rPr>
+          <w:sz w:val="22"/>
+          <w:szCs w:val="22"/>
+        </w:rPr>
+        <w:t xml:space="preserve"> </w:t>
+      </w:r>
+      <w:r>
+        <w:rPr>
+          <w:sz w:val="22"/>
+          <w:szCs w:val="22"/>
+        </w:rPr>
+        <w:t>February</w:t>
+      </w:r>
+      <w:r>
+        <w:rPr>
+          <w:sz w:val="22"/>
+          <w:szCs w:val="22"/>
+        </w:rPr>
+        <w:t xml:space="preserve"> 2026</w:t>
       </w:r>
     </w:p>
     <w:p>

</xml_diff>